<commit_message>
FeatureQuality.docx - fixing lats results
</commit_message>
<xml_diff>
--- a/CIFAR/FeatureQuality.docx
+++ b/CIFAR/FeatureQuality.docx
@@ -275,137 +275,119 @@
     <w:p>
       <w:pPr>
         <w:rPr>
-          <w:lang w:val="en-US"/>
-        </w:rPr>
-      </w:pPr>
-      <w:r>
-        <w:rPr>
-          <w:lang w:val="en-US"/>
-        </w:rPr>
-        <w:t>Scaled filters 3x3</w:t>
-      </w:r>
-      <w:r>
-        <w:rPr>
-          <w:lang w:val="en-US"/>
-        </w:rPr>
-        <w:t>:</w:t>
-      </w:r>
-    </w:p>
-    <w:p>
-      <w:pPr>
-        <w:rPr>
-          <w:lang w:val="en-US"/>
-        </w:rPr>
-      </w:pPr>
-      <w:r>
-        <w:rPr>
-          <w:lang w:val="en-US"/>
-        </w:rPr>
-        <w:t>CNN – acc 5</w:t>
-      </w:r>
-      <w:r>
-        <w:rPr>
-          <w:lang w:val="en-US"/>
-        </w:rPr>
-        <w:t>9</w:t>
-      </w:r>
-      <w:r>
-        <w:rPr>
+          <w:b/>
+          <w:bCs/>
+          <w:lang w:val="en-US"/>
+        </w:rPr>
+      </w:pPr>
+      <w:r>
+        <w:rPr>
+          <w:b/>
+          <w:bCs/>
+          <w:lang w:val="en-US"/>
+        </w:rPr>
+        <w:t>Scaled filters 3x3:</w:t>
+      </w:r>
+    </w:p>
+    <w:p>
+      <w:pPr>
+        <w:rPr>
+          <w:b/>
+          <w:bCs/>
+          <w:lang w:val="en-US"/>
+        </w:rPr>
+      </w:pPr>
+      <w:r>
+        <w:rPr>
+          <w:b/>
+          <w:bCs/>
+          <w:lang w:val="en-US"/>
+        </w:rPr>
+        <w:t>CNN – acc 59.55% eff 59.06%</w:t>
+      </w:r>
+    </w:p>
+    <w:p>
+      <w:pPr>
+        <w:rPr>
+          <w:b/>
+          <w:bCs/>
+          <w:lang w:val="en-US"/>
+        </w:rPr>
+      </w:pPr>
+      <w:r>
+        <w:rPr>
+          <w:b/>
+          <w:bCs/>
+          <w:lang w:val="en-US"/>
+        </w:rPr>
+        <w:t>RF10 – acc 3</w:t>
+      </w:r>
+      <w:r>
+        <w:rPr>
+          <w:b/>
+          <w:bCs/>
+          <w:lang w:val="en-US"/>
+        </w:rPr>
+        <w:t>4</w:t>
+      </w:r>
+      <w:r>
+        <w:rPr>
+          <w:b/>
+          <w:bCs/>
+          <w:lang w:val="en-US"/>
+        </w:rPr>
+        <w:t>.6</w:t>
+      </w:r>
+      <w:r>
+        <w:rPr>
+          <w:b/>
+          <w:bCs/>
+          <w:lang w:val="en-US"/>
+        </w:rPr>
+        <w:t>6</w:t>
+      </w:r>
+      <w:r>
+        <w:rPr>
+          <w:b/>
+          <w:bCs/>
+          <w:lang w:val="en-US"/>
+        </w:rPr>
+        <w:t>% eff 2</w:t>
+      </w:r>
+      <w:r>
+        <w:rPr>
+          <w:b/>
+          <w:bCs/>
+          <w:lang w:val="en-US"/>
+        </w:rPr>
+        <w:t>7</w:t>
+      </w:r>
+      <w:r>
+        <w:rPr>
+          <w:b/>
+          <w:bCs/>
           <w:lang w:val="en-US"/>
         </w:rPr>
         <w:t>.</w:t>
       </w:r>
       <w:r>
         <w:rPr>
-          <w:lang w:val="en-US"/>
-        </w:rPr>
-        <w:t>55</w:t>
-      </w:r>
-      <w:r>
-        <w:rPr>
-          <w:lang w:val="en-US"/>
-        </w:rPr>
-        <w:t xml:space="preserve">% eff </w:t>
-      </w:r>
-      <w:r>
-        <w:rPr>
-          <w:lang w:val="en-US"/>
-        </w:rPr>
-        <w:t>59</w:t>
-      </w:r>
-      <w:r>
-        <w:rPr>
-          <w:lang w:val="en-US"/>
-        </w:rPr>
-        <w:t>.</w:t>
-      </w:r>
-      <w:r>
-        <w:rPr>
-          <w:lang w:val="en-US"/>
-        </w:rPr>
-        <w:t>06</w:t>
-      </w:r>
-      <w:r>
-        <w:rPr>
+          <w:b/>
+          <w:bCs/>
+          <w:lang w:val="en-US"/>
+        </w:rPr>
+        <w:t>4</w:t>
+      </w:r>
+      <w:r>
+        <w:rPr>
+          <w:b/>
+          <w:bCs/>
           <w:lang w:val="en-US"/>
         </w:rPr>
         <w:t>%</w:t>
       </w:r>
     </w:p>
     <w:p>
-      <w:r>
-        <w:rPr>
-          <w:lang w:val="en-US"/>
-        </w:rPr>
-        <w:t>RF</w:t>
-      </w:r>
-      <w:r>
-        <w:t xml:space="preserve">10 – </w:t>
-      </w:r>
-      <w:r>
-        <w:rPr>
-          <w:lang w:val="en-US"/>
-        </w:rPr>
-        <w:t>acc</w:t>
-      </w:r>
-      <w:r>
-        <w:t xml:space="preserve"> 3</w:t>
-      </w:r>
-      <w:r>
-        <w:t>4</w:t>
-      </w:r>
-      <w:r>
-        <w:t>.6</w:t>
-      </w:r>
-      <w:r>
-        <w:t>6</w:t>
-      </w:r>
-      <w:r>
-        <w:t xml:space="preserve">% </w:t>
-      </w:r>
-      <w:r>
-        <w:rPr>
-          <w:lang w:val="en-US"/>
-        </w:rPr>
-        <w:t>eff</w:t>
-      </w:r>
-      <w:r>
-        <w:t xml:space="preserve"> 2</w:t>
-      </w:r>
-      <w:r>
-        <w:t>7</w:t>
-      </w:r>
-      <w:r>
-        <w:t>.</w:t>
-      </w:r>
-      <w:r>
-        <w:t>4</w:t>
-      </w:r>
-      <w:r>
-        <w:t>%</w:t>
-      </w:r>
-    </w:p>
-    <w:p>
       <w:pPr>
         <w:rPr>
           <w:lang w:val="en-US"/>
@@ -467,6 +449,78 @@
         </w:rPr>
         <w:t>RF10 – acc 35.05% eff 27.83%</w:t>
       </w:r>
+    </w:p>
+    <w:p>
+      <w:pPr>
+        <w:rPr>
+          <w:lang w:val="en-US"/>
+        </w:rPr>
+      </w:pPr>
+    </w:p>
+    <w:p>
+      <w:pPr>
+        <w:rPr>
+          <w:lang w:val="en-US"/>
+        </w:rPr>
+      </w:pPr>
+      <w:r>
+        <w:rPr>
+          <w:lang w:val="en-US"/>
+        </w:rPr>
+        <w:t>Unsupervised filters after scaled filter 3x3</w:t>
+      </w:r>
+    </w:p>
+    <w:p>
+      <w:pPr>
+        <w:rPr>
+          <w:lang w:val="en-US"/>
+        </w:rPr>
+      </w:pPr>
+      <w:r>
+        <w:rPr>
+          <w:lang w:val="en-US"/>
+        </w:rPr>
+        <w:t>CNN – acc 52.58% eff 47.31%</w:t>
+      </w:r>
+    </w:p>
+    <w:p>
+      <w:pPr>
+        <w:rPr>
+          <w:lang w:val="en-US"/>
+        </w:rPr>
+      </w:pPr>
+      <w:r>
+        <w:rPr>
+          <w:lang w:val="en-US"/>
+        </w:rPr>
+        <w:t>RF1</w:t>
+      </w:r>
+      <w:r>
+        <w:rPr>
+          <w:lang w:val="en-US"/>
+        </w:rPr>
+        <w:t xml:space="preserve">0 </w:t>
+      </w:r>
+      <w:r>
+        <w:rPr>
+          <w:lang w:val="en-US"/>
+        </w:rPr>
+        <w:t>- acc 32.37% eff 24.86%</w:t>
+      </w:r>
+    </w:p>
+    <w:p>
+      <w:pPr>
+        <w:rPr>
+          <w:lang w:val="en-US"/>
+        </w:rPr>
+      </w:pPr>
+    </w:p>
+    <w:p>
+      <w:pPr>
+        <w:rPr>
+          <w:lang w:val="en-US"/>
+        </w:rPr>
+      </w:pPr>
     </w:p>
     <w:p>
       <w:r>
@@ -796,6 +850,7 @@
         </w:numPr>
       </w:pPr>
       <w:r>
+        <w:lastRenderedPageBreak/>
         <w:t>Загрузить фильтры из файлов.</w:t>
       </w:r>
     </w:p>
@@ -880,7 +935,6 @@
         <w:rPr>
           <w:lang w:val="en-US"/>
         </w:rPr>
-        <w:lastRenderedPageBreak/>
         <w:t>Vmax</w:t>
       </w:r>
       <w:r>

</xml_diff>